<commit_message>
BaiHoc v2 polished for de hieu + tinh su pham: (1) add GLOSSARY page with 9 terms (anxiety/RCADS/beta/R2/SEM/LPA/DSM-ICD/Q-ranking/validated scale); (2) introduce hypothetical student 'Mai 13 tuổi grade 7 Tây Mỗ' as recurring case; (3) Mai reference on Pages 1, 3 (SocAD identification); (4) SEM city-map analogy Page 7; (5) Invariance two-map-version analogy Page 9; (6) LPA library-shelf analogy Page 10; (7) Self-check Q+A on Pages 1, 3, 7, 10; all 48 methods PASS
</commit_message>
<xml_diff>
--- a/bai-bao-Q1/BaiHoc_NhapMonTLH_10trang_SongNgu_08062026.docx
+++ b/bai-bao-Q1/BaiHoc_NhapMonTLH_10trang_SongNgu_08062026.docx
@@ -81,6 +81,418 @@
     </w:p>
     <w:p>
       <w:pPr>
+        <w:jc w:val="center"/>
+      </w:pPr>
+      <w:r>
+        <w:rPr>
+          <w:rFonts w:ascii="Times New Roman" w:hAnsi="Times New Roman"/>
+          <w:b/>
+          <w:color w:val="C00000"/>
+          <w:sz w:val="28"/>
+        </w:rPr>
+        <w:t>TỪ ĐIỂN THUẬT NGỮ NHANH / QUICK GLOSSARY</w:t>
+      </w:r>
+    </w:p>
+    <w:p>
+      <w:pPr>
+        <w:spacing w:after="200"/>
+        <w:jc w:val="center"/>
+      </w:pPr>
+      <w:r>
+        <w:rPr>
+          <w:rFonts w:ascii="Times New Roman" w:hAnsi="Times New Roman"/>
+          <w:i/>
+          <w:color w:val="505050"/>
+          <w:sz w:val="22"/>
+        </w:rPr>
+        <w:t>Cứ giở trang này khi gặp từ chưa rõ. Read this page first or whenever a term is unclear.</w:t>
+      </w:r>
+    </w:p>
+    <w:p>
+      <w:pPr>
+        <w:spacing w:after="40"/>
+      </w:pPr>
+      <w:r>
+        <w:rPr>
+          <w:rFonts w:ascii="Times New Roman" w:hAnsi="Times New Roman"/>
+          <w:b/>
+          <w:color w:val="2E74B5"/>
+          <w:sz w:val="22"/>
+        </w:rPr>
+        <w:t>Anxiety vs Anxiety Disorder / Lo âu vs Rối loạn lo âu</w:t>
+      </w:r>
+    </w:p>
+    <w:p>
+      <w:pPr>
+        <w:spacing w:after="40"/>
+        <w:ind w:left="283"/>
+      </w:pPr>
+      <w:r>
+        <w:rPr>
+          <w:rFonts w:ascii="Times New Roman" w:hAnsi="Times New Roman"/>
+          <w:sz w:val="20"/>
+        </w:rPr>
+        <w:t>Anxiety = a normal emotion (worry before exam). Anxiety disorder = persistent worry (≥6 months), excessive, and impairing daily life.</w:t>
+      </w:r>
+    </w:p>
+    <w:p>
+      <w:pPr>
+        <w:spacing w:after="120"/>
+        <w:ind w:left="283"/>
+      </w:pPr>
+      <w:r>
+        <w:rPr>
+          <w:rFonts w:ascii="Times New Roman" w:hAnsi="Times New Roman"/>
+          <w:i/>
+          <w:color w:val="333333"/>
+          <w:sz w:val="20"/>
+        </w:rPr>
+        <w:t>Lo âu = cảm xúc bình thường (lo trước kỳ thi). Rối loạn lo âu = lo lắng dai dẳng (≥6 tháng), quá mức, làm suy giảm sinh hoạt hàng ngày.</w:t>
+      </w:r>
+    </w:p>
+    <w:p>
+      <w:pPr>
+        <w:spacing w:after="40"/>
+      </w:pPr>
+      <w:r>
+        <w:rPr>
+          <w:rFonts w:ascii="Times New Roman" w:hAnsi="Times New Roman"/>
+          <w:b/>
+          <w:color w:val="2E74B5"/>
+          <w:sz w:val="22"/>
+        </w:rPr>
+        <w:t>RCADS / Thang RCADS</w:t>
+      </w:r>
+    </w:p>
+    <w:p>
+      <w:pPr>
+        <w:spacing w:after="40"/>
+        <w:ind w:left="283"/>
+      </w:pPr>
+      <w:r>
+        <w:rPr>
+          <w:rFonts w:ascii="Times New Roman" w:hAnsi="Times New Roman"/>
+          <w:sz w:val="20"/>
+        </w:rPr>
+        <w:t>Revised Children's Anxiety and Depression Scale — a questionnaire designed for ages 8–18 that produces separate scores for GAD, SAD, SocAD and other subtypes.</w:t>
+      </w:r>
+    </w:p>
+    <w:p>
+      <w:pPr>
+        <w:spacing w:after="120"/>
+        <w:ind w:left="283"/>
+      </w:pPr>
+      <w:r>
+        <w:rPr>
+          <w:rFonts w:ascii="Times New Roman" w:hAnsi="Times New Roman"/>
+          <w:i/>
+          <w:color w:val="333333"/>
+          <w:sz w:val="20"/>
+        </w:rPr>
+        <w:t>Thang đo lo âu và trầm cảm trẻ em phiên bản sửa đổi — bảng hỏi cho 8–18 tuổi, cho điểm riêng cho từng phân loại lo âu (GAD, SAD, SocAD và các loại khác).</w:t>
+      </w:r>
+    </w:p>
+    <w:p>
+      <w:pPr>
+        <w:spacing w:after="40"/>
+      </w:pPr>
+      <w:r>
+        <w:rPr>
+          <w:rFonts w:ascii="Times New Roman" w:hAnsi="Times New Roman"/>
+          <w:b/>
+          <w:color w:val="2E74B5"/>
+          <w:sz w:val="22"/>
+        </w:rPr>
+        <w:t>β (beta) / Hệ số β (beta)</w:t>
+      </w:r>
+    </w:p>
+    <w:p>
+      <w:pPr>
+        <w:spacing w:after="40"/>
+        <w:ind w:left="283"/>
+      </w:pPr>
+      <w:r>
+        <w:rPr>
+          <w:rFonts w:ascii="Times New Roman" w:hAnsi="Times New Roman"/>
+          <w:sz w:val="20"/>
+        </w:rPr>
+        <w:t>A standardized pathway coefficient from −1 to +1. Near 0 = weak effect; near ±1 = strong effect. β = 0.376 means a clearly meaningful effect; β = 0.05 would be trivial.</w:t>
+      </w:r>
+    </w:p>
+    <w:p>
+      <w:pPr>
+        <w:spacing w:after="120"/>
+        <w:ind w:left="283"/>
+      </w:pPr>
+      <w:r>
+        <w:rPr>
+          <w:rFonts w:ascii="Times New Roman" w:hAnsi="Times New Roman"/>
+          <w:i/>
+          <w:color w:val="333333"/>
+          <w:sz w:val="20"/>
+        </w:rPr>
+        <w:t>Hệ số đường dẫn đã chuẩn hóa, có giá trị từ −1 tới +1. Gần 0 = hiệu ứng yếu; gần ±1 = hiệu ứng mạnh. β = 0,376 = hiệu ứng có ý nghĩa; β = 0,05 = không đáng kể.</w:t>
+      </w:r>
+    </w:p>
+    <w:p>
+      <w:pPr>
+        <w:spacing w:after="40"/>
+      </w:pPr>
+      <w:r>
+        <w:rPr>
+          <w:rFonts w:ascii="Times New Roman" w:hAnsi="Times New Roman"/>
+          <w:b/>
+          <w:color w:val="2E74B5"/>
+          <w:sz w:val="22"/>
+        </w:rPr>
+        <w:t>R² (R squared) / Hệ số R² (R bình phương)</w:t>
+      </w:r>
+    </w:p>
+    <w:p>
+      <w:pPr>
+        <w:spacing w:after="40"/>
+        <w:ind w:left="283"/>
+      </w:pPr>
+      <w:r>
+        <w:rPr>
+          <w:rFonts w:ascii="Times New Roman" w:hAnsi="Times New Roman"/>
+          <w:sz w:val="20"/>
+        </w:rPr>
+        <w:t>The proportion of variance explained. R² = 0.598 means the model explains 60% of why anxiety scores differ between students.</w:t>
+      </w:r>
+    </w:p>
+    <w:p>
+      <w:pPr>
+        <w:spacing w:after="120"/>
+        <w:ind w:left="283"/>
+      </w:pPr>
+      <w:r>
+        <w:rPr>
+          <w:rFonts w:ascii="Times New Roman" w:hAnsi="Times New Roman"/>
+          <w:i/>
+          <w:color w:val="333333"/>
+          <w:sz w:val="20"/>
+        </w:rPr>
+        <w:t>Tỷ lệ phương sai được giải thích. R² = 0,598 nghĩa là mô hình giải thích 60% lý do điểm lo âu của học sinh khác nhau.</w:t>
+      </w:r>
+    </w:p>
+    <w:p>
+      <w:pPr>
+        <w:spacing w:after="40"/>
+      </w:pPr>
+      <w:r>
+        <w:rPr>
+          <w:rFonts w:ascii="Times New Roman" w:hAnsi="Times New Roman"/>
+          <w:b/>
+          <w:color w:val="2E74B5"/>
+          <w:sz w:val="22"/>
+        </w:rPr>
+        <w:t>SEM / SEM (mô hình phương trình cấu trúc)</w:t>
+      </w:r>
+    </w:p>
+    <w:p>
+      <w:pPr>
+        <w:spacing w:after="40"/>
+        <w:ind w:left="283"/>
+      </w:pPr>
+      <w:r>
+        <w:rPr>
+          <w:rFonts w:ascii="Times New Roman" w:hAnsi="Times New Roman"/>
+          <w:sz w:val="20"/>
+        </w:rPr>
+        <w:t>Structural Equation Modeling — a statistical method that tests many cause-effect pathways at once in a single model.</w:t>
+      </w:r>
+    </w:p>
+    <w:p>
+      <w:pPr>
+        <w:spacing w:after="120"/>
+        <w:ind w:left="283"/>
+      </w:pPr>
+      <w:r>
+        <w:rPr>
+          <w:rFonts w:ascii="Times New Roman" w:hAnsi="Times New Roman"/>
+          <w:i/>
+          <w:color w:val="333333"/>
+          <w:sz w:val="20"/>
+        </w:rPr>
+        <w:t>Phương pháp thống kê kiểm tra đồng thời nhiều đường dẫn nguyên nhân-hậu quả trong một mô hình duy nhất.</w:t>
+      </w:r>
+    </w:p>
+    <w:p>
+      <w:pPr>
+        <w:spacing w:after="40"/>
+      </w:pPr>
+      <w:r>
+        <w:rPr>
+          <w:rFonts w:ascii="Times New Roman" w:hAnsi="Times New Roman"/>
+          <w:b/>
+          <w:color w:val="2E74B5"/>
+          <w:sz w:val="22"/>
+        </w:rPr>
+        <w:t>LPA / LPA (phân tích hồ sơ tiềm ẩn)</w:t>
+      </w:r>
+    </w:p>
+    <w:p>
+      <w:pPr>
+        <w:spacing w:after="40"/>
+        <w:ind w:left="283"/>
+      </w:pPr>
+      <w:r>
+        <w:rPr>
+          <w:rFonts w:ascii="Times New Roman" w:hAnsi="Times New Roman"/>
+          <w:sz w:val="20"/>
+        </w:rPr>
+        <w:t>Latent Profile Analysis — a method that groups individuals into "types" (e.g., high-stress vs low-stress students) based on patterns of measured variables.</w:t>
+      </w:r>
+    </w:p>
+    <w:p>
+      <w:pPr>
+        <w:spacing w:after="120"/>
+        <w:ind w:left="283"/>
+      </w:pPr>
+      <w:r>
+        <w:rPr>
+          <w:rFonts w:ascii="Times New Roman" w:hAnsi="Times New Roman"/>
+          <w:i/>
+          <w:color w:val="333333"/>
+          <w:sz w:val="20"/>
+        </w:rPr>
+        <w:t>Phương pháp gộp các cá nhân thành các "loại" (ví dụ học sinh cao áp lực vs thấp áp lực) dựa trên mẫu hình các biến đã đo.</w:t>
+      </w:r>
+    </w:p>
+    <w:p>
+      <w:pPr>
+        <w:spacing w:after="40"/>
+      </w:pPr>
+      <w:r>
+        <w:rPr>
+          <w:rFonts w:ascii="Times New Roman" w:hAnsi="Times New Roman"/>
+          <w:b/>
+          <w:color w:val="2E74B5"/>
+          <w:sz w:val="22"/>
+        </w:rPr>
+        <w:t>DSM-5 / ICD-11 / DSM-5 / ICD-11</w:t>
+      </w:r>
+    </w:p>
+    <w:p>
+      <w:pPr>
+        <w:spacing w:after="40"/>
+        <w:ind w:left="283"/>
+      </w:pPr>
+      <w:r>
+        <w:rPr>
+          <w:rFonts w:ascii="Times New Roman" w:hAnsi="Times New Roman"/>
+          <w:sz w:val="20"/>
+        </w:rPr>
+        <w:t>Two international classification systems for mental disorders. DSM-5 (2013, American Psychiatric Association) and ICD-11 (2022, World Health Organization).</w:t>
+      </w:r>
+    </w:p>
+    <w:p>
+      <w:pPr>
+        <w:spacing w:after="120"/>
+        <w:ind w:left="283"/>
+      </w:pPr>
+      <w:r>
+        <w:rPr>
+          <w:rFonts w:ascii="Times New Roman" w:hAnsi="Times New Roman"/>
+          <w:i/>
+          <w:color w:val="333333"/>
+          <w:sz w:val="20"/>
+        </w:rPr>
+        <w:t>Hai hệ phân loại rối loạn tâm thần quốc tế. DSM-5 (2013, Hiệp hội Tâm thần học Hoa Kỳ) và ICD-11 (2022, Tổ chức Y tế Thế giới).</w:t>
+      </w:r>
+    </w:p>
+    <w:p>
+      <w:pPr>
+        <w:spacing w:after="40"/>
+      </w:pPr>
+      <w:r>
+        <w:rPr>
+          <w:rFonts w:ascii="Times New Roman" w:hAnsi="Times New Roman"/>
+          <w:b/>
+          <w:color w:val="2E74B5"/>
+          <w:sz w:val="22"/>
+        </w:rPr>
+        <w:t>Q1 / Q2 ranking / Q1 / Q2 ranking</w:t>
+      </w:r>
+    </w:p>
+    <w:p>
+      <w:pPr>
+        <w:spacing w:after="40"/>
+        <w:ind w:left="283"/>
+      </w:pPr>
+      <w:r>
+        <w:rPr>
+          <w:rFonts w:ascii="Times New Roman" w:hAnsi="Times New Roman"/>
+          <w:sz w:val="20"/>
+        </w:rPr>
+        <w:t>Quartile ranking of academic journals. Q1 = top 25% by impact; Q2 = next 25%. Higher Q = harder to publish in.</w:t>
+      </w:r>
+    </w:p>
+    <w:p>
+      <w:pPr>
+        <w:spacing w:after="120"/>
+        <w:ind w:left="283"/>
+      </w:pPr>
+      <w:r>
+        <w:rPr>
+          <w:rFonts w:ascii="Times New Roman" w:hAnsi="Times New Roman"/>
+          <w:i/>
+          <w:color w:val="333333"/>
+          <w:sz w:val="20"/>
+        </w:rPr>
+        <w:t>Phân hạng theo tứ phân vị của tạp chí học thuật. Q1 = 25% đầu theo hệ số tác động; Q2 = 25% tiếp. Q càng cao = càng khó công bố.</w:t>
+      </w:r>
+    </w:p>
+    <w:p>
+      <w:pPr>
+        <w:spacing w:after="40"/>
+      </w:pPr>
+      <w:r>
+        <w:rPr>
+          <w:rFonts w:ascii="Times New Roman" w:hAnsi="Times New Roman"/>
+          <w:b/>
+          <w:color w:val="2E74B5"/>
+          <w:sz w:val="22"/>
+        </w:rPr>
+        <w:t>Validated scale / Thang đo đã chuẩn hóa</w:t>
+      </w:r>
+    </w:p>
+    <w:p>
+      <w:pPr>
+        <w:spacing w:after="40"/>
+        <w:ind w:left="283"/>
+      </w:pPr>
+      <w:r>
+        <w:rPr>
+          <w:rFonts w:ascii="Times New Roman" w:hAnsi="Times New Roman"/>
+          <w:sz w:val="20"/>
+        </w:rPr>
+        <w:t>A questionnaire whose reliability and validity have been tested. We use 8 such scales adapted to Vietnamese.</w:t>
+      </w:r>
+    </w:p>
+    <w:p>
+      <w:pPr>
+        <w:spacing w:after="120"/>
+        <w:ind w:left="283"/>
+      </w:pPr>
+      <w:r>
+        <w:rPr>
+          <w:rFonts w:ascii="Times New Roman" w:hAnsi="Times New Roman"/>
+          <w:i/>
+          <w:color w:val="333333"/>
+          <w:sz w:val="20"/>
+        </w:rPr>
+        <w:t>Bảng hỏi đã được kiểm chứng độ tin cậy và tính giá trị. Chúng tôi sử dụng 8 thang đo loại này đã được chuyển ngữ sang tiếng Việt.</w:t>
+      </w:r>
+    </w:p>
+    <w:p>
+      <w:r>
+        <w:br w:type="page"/>
+      </w:r>
+    </w:p>
+    <w:p>
+      <w:pPr>
         <w:spacing w:before="360" w:after="200"/>
         <w:jc w:val="center"/>
       </w:pPr>
@@ -271,6 +683,124 @@
           <w:sz w:val="22"/>
         </w:rPr>
         <w:t>▣ KHÁI NIỆM CỐT LÕI — Rối loạn lo âu KHÔNG đơn thuần là "căng thẳng" — đó là tình trạng lâm sàng riêng biệt, có tiêu chí chẩn đoán cụ thể, kéo dài nhiều tháng và làm suy giảm chức năng sinh hoạt hàng ngày.</w:t>
+      </w:r>
+    </w:p>
+    <w:p>
+      <w:pPr>
+        <w:spacing w:before="200" w:after="80"/>
+      </w:pPr>
+      <w:r>
+        <w:rPr>
+          <w:rFonts w:ascii="Times New Roman" w:hAnsi="Times New Roman"/>
+          <w:b/>
+          <w:color w:val="2E74B5"/>
+          <w:sz w:val="24"/>
+        </w:rPr>
+        <w:t>1.4 — Meet our example student / Làm quen với học sinh ví dụ</w:t>
+      </w:r>
+    </w:p>
+    <w:p>
+      <w:pPr>
+        <w:spacing w:after="80"/>
+        <w:ind w:firstLine="283"/>
+        <w:jc w:val="both"/>
+      </w:pPr>
+      <w:r>
+        <w:rPr>
+          <w:rFonts w:ascii="Times New Roman" w:hAnsi="Times New Roman"/>
+          <w:sz w:val="22"/>
+        </w:rPr>
+        <w:t>Throughout this primer we use a hypothetical student, "Mai", to ground abstract ideas. Mai is 13 years old, in grade 7 at Tay Mo school in Hanoi. She studies hard, but recently has been avoiding class presentations and complaining of stomach aches on school mornings. Her parents wonder if it is just teenage mood or something more. Each page below will return to Mai briefly to show how the concept applies in real life.</w:t>
+      </w:r>
+    </w:p>
+    <w:p>
+      <w:pPr>
+        <w:spacing w:after="160"/>
+        <w:ind w:firstLine="283" w:left="170"/>
+        <w:jc w:val="both"/>
+      </w:pPr>
+      <w:r>
+        <w:rPr>
+          <w:rFonts w:ascii="Times New Roman" w:hAnsi="Times New Roman"/>
+          <w:i/>
+          <w:color w:val="333333"/>
+          <w:sz w:val="22"/>
+        </w:rPr>
+        <w:t>Xuyên suốt tài liệu này, chúng ta dùng một học sinh giả định tên "Mai" để làm rõ các khái niệm trừu tượng. Mai 13 tuổi, học lớp 7 trường Tây Mỗ Hà Nội. Em học chăm, nhưng gần đây hay tránh thuyết trình trước lớp và phàn nàn đau bụng vào sáng những ngày đi học. Cha mẹ Mai phân vân không biết đây là tâm trạng tuổi teen bình thường hay điều gì đó nghiêm trọng hơn. Mỗi trang dưới đây sẽ quay lại với Mai một chút để minh họa khái niệm áp dụng trong đời thực.</w:t>
+      </w:r>
+    </w:p>
+    <w:p>
+      <w:pPr>
+        <w:spacing w:before="200" w:after="80"/>
+      </w:pPr>
+      <w:r>
+        <w:rPr>
+          <w:rFonts w:ascii="Times New Roman" w:hAnsi="Times New Roman"/>
+          <w:b/>
+          <w:color w:val="2E74B5"/>
+          <w:sz w:val="24"/>
+        </w:rPr>
+        <w:t>1.5 — Self-check / Câu hỏi tự kiểm tra</w:t>
+      </w:r>
+    </w:p>
+    <w:p>
+      <w:pPr>
+        <w:spacing w:after="80"/>
+        <w:ind w:firstLine="283"/>
+        <w:jc w:val="both"/>
+      </w:pPr>
+      <w:r>
+        <w:rPr>
+          <w:rFonts w:ascii="Times New Roman" w:hAnsi="Times New Roman"/>
+          <w:sz w:val="22"/>
+        </w:rPr>
+        <w:t>Q: Why does adolescence (ages 11–18) deserve special attention in mental health research?</w:t>
+      </w:r>
+    </w:p>
+    <w:p>
+      <w:pPr>
+        <w:spacing w:after="160"/>
+        <w:ind w:firstLine="283" w:left="170"/>
+        <w:jc w:val="both"/>
+      </w:pPr>
+      <w:r>
+        <w:rPr>
+          <w:rFonts w:ascii="Times New Roman" w:hAnsi="Times New Roman"/>
+          <w:i/>
+          <w:color w:val="333333"/>
+          <w:sz w:val="22"/>
+        </w:rPr>
+        <w:t>Hỏi: Tại sao tuổi vị thành niên (11–18) cần được chú ý đặc biệt trong nghiên cứu sức khỏe tâm thần?</w:t>
+      </w:r>
+    </w:p>
+    <w:p>
+      <w:pPr>
+        <w:spacing w:after="80"/>
+        <w:ind w:firstLine="283"/>
+        <w:jc w:val="both"/>
+      </w:pPr>
+      <w:r>
+        <w:rPr>
+          <w:rFonts w:ascii="Times New Roman" w:hAnsi="Times New Roman"/>
+          <w:sz w:val="22"/>
+        </w:rPr>
+        <w:t>A: Because half of all lifetime mental disorders begin by age 14 (Kessler 2005), and the cohort is currently undergoing the fastest physical, social, and emotional development of life.</w:t>
+      </w:r>
+    </w:p>
+    <w:p>
+      <w:pPr>
+        <w:spacing w:after="160"/>
+        <w:ind w:firstLine="283" w:left="170"/>
+        <w:jc w:val="both"/>
+      </w:pPr>
+      <w:r>
+        <w:rPr>
+          <w:rFonts w:ascii="Times New Roman" w:hAnsi="Times New Roman"/>
+          <w:i/>
+          <w:color w:val="333333"/>
+          <w:sz w:val="22"/>
+        </w:rPr>
+        <w:t>Đáp: Vì một nửa số ca rối loạn tâm thần khởi phát trước tuổi 14 (Kessler 2005), và đây là giai đoạn phát triển nhanh nhất về thể chất, xã hội, và cảm xúc trong đời.</w:t>
       </w:r>
     </w:p>
     <w:p>
@@ -641,6 +1171,124 @@
       </w:r>
     </w:p>
     <w:p>
+      <w:pPr>
+        <w:spacing w:before="200" w:after="80"/>
+      </w:pPr>
+      <w:r>
+        <w:rPr>
+          <w:rFonts w:ascii="Times New Roman" w:hAnsi="Times New Roman"/>
+          <w:b/>
+          <w:color w:val="2E74B5"/>
+          <w:sz w:val="24"/>
+        </w:rPr>
+        <w:t>3.4 — Back to Mai / Quay lại với Mai</w:t>
+      </w:r>
+    </w:p>
+    <w:p>
+      <w:pPr>
+        <w:spacing w:after="80"/>
+        <w:ind w:firstLine="283"/>
+        <w:jc w:val="both"/>
+      </w:pPr>
+      <w:r>
+        <w:rPr>
+          <w:rFonts w:ascii="Times New Roman" w:hAnsi="Times New Roman"/>
+          <w:sz w:val="22"/>
+        </w:rPr>
+        <w:t>Mai's avoidance of class presentations and physical symptoms before school suggest SocAD (Social Anxiety Disorder) is most likely — fear of being judged in social situations. She does not show separation anxiety (does not refuse to sleep alone) or generalized worry about many topics. A clinician would screen her using RCADS subscales to confirm.</w:t>
+      </w:r>
+    </w:p>
+    <w:p>
+      <w:pPr>
+        <w:spacing w:after="160"/>
+        <w:ind w:firstLine="283" w:left="170"/>
+        <w:jc w:val="both"/>
+      </w:pPr>
+      <w:r>
+        <w:rPr>
+          <w:rFonts w:ascii="Times New Roman" w:hAnsi="Times New Roman"/>
+          <w:i/>
+          <w:color w:val="333333"/>
+          <w:sz w:val="22"/>
+        </w:rPr>
+        <w:t>Việc Mai tránh thuyết trình và có triệu chứng cơ thể trước khi đến trường gợi ý nhiều khả năng là SocAD (Rối loạn Lo âu Xã hội) — sợ bị đánh giá trong tình huống xã hội. Mai không có biểu hiện lo âu chia ly (không từ chối ngủ một mình) hay lo lắng lan tỏa về nhiều chủ đề. Bác sĩ tâm lý sẽ sàng lọc bằng các tiểu thang RCADS để xác nhận.</w:t>
+      </w:r>
+    </w:p>
+    <w:p>
+      <w:pPr>
+        <w:spacing w:before="200" w:after="80"/>
+      </w:pPr>
+      <w:r>
+        <w:rPr>
+          <w:rFonts w:ascii="Times New Roman" w:hAnsi="Times New Roman"/>
+          <w:b/>
+          <w:color w:val="2E74B5"/>
+          <w:sz w:val="24"/>
+        </w:rPr>
+        <w:t>3.5 — Self-check / Câu hỏi tự kiểm tra</w:t>
+      </w:r>
+    </w:p>
+    <w:p>
+      <w:pPr>
+        <w:spacing w:after="80"/>
+        <w:ind w:firstLine="283"/>
+        <w:jc w:val="both"/>
+      </w:pPr>
+      <w:r>
+        <w:rPr>
+          <w:rFonts w:ascii="Times New Roman" w:hAnsi="Times New Roman"/>
+          <w:sz w:val="22"/>
+        </w:rPr>
+        <w:t>Q: How can a teacher tell SocAD apart from ordinary shyness?</w:t>
+      </w:r>
+    </w:p>
+    <w:p>
+      <w:pPr>
+        <w:spacing w:after="160"/>
+        <w:ind w:firstLine="283" w:left="170"/>
+        <w:jc w:val="both"/>
+      </w:pPr>
+      <w:r>
+        <w:rPr>
+          <w:rFonts w:ascii="Times New Roman" w:hAnsi="Times New Roman"/>
+          <w:i/>
+          <w:color w:val="333333"/>
+          <w:sz w:val="22"/>
+        </w:rPr>
+        <w:t>Hỏi: Làm sao giáo viên có thể phân biệt SocAD với sự nhút nhát thông thường?</w:t>
+      </w:r>
+    </w:p>
+    <w:p>
+      <w:pPr>
+        <w:spacing w:after="80"/>
+        <w:ind w:firstLine="283"/>
+        <w:jc w:val="both"/>
+      </w:pPr>
+      <w:r>
+        <w:rPr>
+          <w:rFonts w:ascii="Times New Roman" w:hAnsi="Times New Roman"/>
+          <w:sz w:val="22"/>
+        </w:rPr>
+        <w:t>A: SocAD is persistent (months), excessive (fear far greater than the actual risk), and impairing (the student avoids school or fails academically). Shyness is mild, transient, and does not disrupt functioning.</w:t>
+      </w:r>
+    </w:p>
+    <w:p>
+      <w:pPr>
+        <w:spacing w:after="160"/>
+        <w:ind w:firstLine="283" w:left="170"/>
+        <w:jc w:val="both"/>
+      </w:pPr>
+      <w:r>
+        <w:rPr>
+          <w:rFonts w:ascii="Times New Roman" w:hAnsi="Times New Roman"/>
+          <w:i/>
+          <w:color w:val="333333"/>
+          <w:sz w:val="22"/>
+        </w:rPr>
+        <w:t>Đáp: SocAD dai dẳng (nhiều tháng), quá mức (sợ vượt xa nguy cơ thực), và gây suy giảm (học sinh trốn học hoặc kết quả học tập kém). Nhút nhát thì nhẹ, thoáng qua, và không làm gián đoạn chức năng.</w:t>
+      </w:r>
+    </w:p>
+    <w:p>
       <w:r>
         <w:br w:type="page"/>
       </w:r>
@@ -1388,6 +2036,124 @@
       </w:r>
     </w:p>
     <w:p>
+      <w:pPr>
+        <w:spacing w:before="200" w:after="80"/>
+      </w:pPr>
+      <w:r>
+        <w:rPr>
+          <w:rFonts w:ascii="Times New Roman" w:hAnsi="Times New Roman"/>
+          <w:b/>
+          <w:color w:val="2E74B5"/>
+          <w:sz w:val="24"/>
+        </w:rPr>
+        <w:t>7.4 — Helpful analogy / Phép ẩn dụ giúp dễ hình dung</w:t>
+      </w:r>
+    </w:p>
+    <w:p>
+      <w:pPr>
+        <w:spacing w:after="80"/>
+        <w:ind w:firstLine="283"/>
+        <w:jc w:val="both"/>
+      </w:pPr>
+      <w:r>
+        <w:rPr>
+          <w:rFonts w:ascii="Times New Roman" w:hAnsi="Times New Roman"/>
+          <w:sz w:val="22"/>
+        </w:rPr>
+        <w:t>Think of SEM as a map of a city. Each road on the map is a pathway (β coefficient) between two locations (variables). Ordinary regression draws one road at a time. SEM draws the whole road network at once — showing not just whether each road exists, but whether the whole transport system makes sense as a unit. Goodness-of-fit indices are like asking: does our map match the real city? CFI ≥ 0.90 = a good enough match.</w:t>
+      </w:r>
+    </w:p>
+    <w:p>
+      <w:pPr>
+        <w:spacing w:after="160"/>
+        <w:ind w:firstLine="283" w:left="170"/>
+        <w:jc w:val="both"/>
+      </w:pPr>
+      <w:r>
+        <w:rPr>
+          <w:rFonts w:ascii="Times New Roman" w:hAnsi="Times New Roman"/>
+          <w:i/>
+          <w:color w:val="333333"/>
+          <w:sz w:val="22"/>
+        </w:rPr>
+        <w:t>Hãy tưởng tượng SEM như tấm bản đồ một thành phố. Mỗi con đường trên bản đồ là một đường dẫn (hệ số β) giữa hai địa điểm (biến). Hồi quy thông thường vẽ một con đường tại một thời điểm. SEM vẽ toàn bộ mạng lưới đường cùng lúc — cho biết không chỉ từng đường có tồn tại không, mà cả hệ thống giao thông có hợp lý không. Các chỉ số độ phù hợp giống như hỏi: bản đồ của chúng ta có khớp với thành phố thực không? CFI ≥ 0,90 = khớp đủ tốt.</w:t>
+      </w:r>
+    </w:p>
+    <w:p>
+      <w:pPr>
+        <w:spacing w:before="200" w:after="80"/>
+      </w:pPr>
+      <w:r>
+        <w:rPr>
+          <w:rFonts w:ascii="Times New Roman" w:hAnsi="Times New Roman"/>
+          <w:b/>
+          <w:color w:val="2E74B5"/>
+          <w:sz w:val="24"/>
+        </w:rPr>
+        <w:t>7.5 — Self-check / Câu hỏi tự kiểm tra</w:t>
+      </w:r>
+    </w:p>
+    <w:p>
+      <w:pPr>
+        <w:spacing w:after="80"/>
+        <w:ind w:firstLine="283"/>
+        <w:jc w:val="both"/>
+      </w:pPr>
+      <w:r>
+        <w:rPr>
+          <w:rFonts w:ascii="Times New Roman" w:hAnsi="Times New Roman"/>
+          <w:sz w:val="22"/>
+        </w:rPr>
+        <w:t>Q: What makes SEM more powerful than running 10 separate regressions?</w:t>
+      </w:r>
+    </w:p>
+    <w:p>
+      <w:pPr>
+        <w:spacing w:after="160"/>
+        <w:ind w:firstLine="283" w:left="170"/>
+        <w:jc w:val="both"/>
+      </w:pPr>
+      <w:r>
+        <w:rPr>
+          <w:rFonts w:ascii="Times New Roman" w:hAnsi="Times New Roman"/>
+          <w:i/>
+          <w:color w:val="333333"/>
+          <w:sz w:val="22"/>
+        </w:rPr>
+        <w:t>Hỏi: Điều gì khiến SEM mạnh hơn việc chạy 10 hồi quy riêng lẻ?</w:t>
+      </w:r>
+    </w:p>
+    <w:p>
+      <w:pPr>
+        <w:spacing w:after="80"/>
+        <w:ind w:firstLine="283"/>
+        <w:jc w:val="both"/>
+      </w:pPr>
+      <w:r>
+        <w:rPr>
+          <w:rFonts w:ascii="Times New Roman" w:hAnsi="Times New Roman"/>
+          <w:sz w:val="22"/>
+        </w:rPr>
+        <w:t>A: SEM tests all relationships simultaneously so error compounds less, models measurement error in latent variables, and provides a single fit statistic showing whether the whole theory holds.</w:t>
+      </w:r>
+    </w:p>
+    <w:p>
+      <w:pPr>
+        <w:spacing w:after="160"/>
+        <w:ind w:firstLine="283" w:left="170"/>
+        <w:jc w:val="both"/>
+      </w:pPr>
+      <w:r>
+        <w:rPr>
+          <w:rFonts w:ascii="Times New Roman" w:hAnsi="Times New Roman"/>
+          <w:i/>
+          <w:color w:val="333333"/>
+          <w:sz w:val="22"/>
+        </w:rPr>
+        <w:t>Đáp: SEM kiểm tra tất cả mối quan hệ cùng lúc nên sai số ít tích lũy hơn, mô hình hóa được sai số đo lường trong biến tiềm ẩn, và cho một chỉ số phù hợp duy nhất cho biết toàn bộ lý thuyết có đúng không.</w:t>
+      </w:r>
+    </w:p>
+    <w:p>
       <w:r>
         <w:br w:type="page"/>
       </w:r>
@@ -1690,7 +2456,51 @@
           <w:color w:val="2E74B5"/>
           <w:sz w:val="24"/>
         </w:rPr>
-        <w:t>9.3 — Cultural-developmental framing / Khung phát triển-văn hóa</w:t>
+        <w:t>9.3 — Invariance analogy / Phép ẩn dụ về bất biến</w:t>
+      </w:r>
+    </w:p>
+    <w:p>
+      <w:pPr>
+        <w:spacing w:after="80"/>
+        <w:ind w:firstLine="283"/>
+        <w:jc w:val="both"/>
+      </w:pPr>
+      <w:r>
+        <w:rPr>
+          <w:rFonts w:ascii="Times New Roman" w:hAnsi="Times New Roman"/>
+          <w:sz w:val="22"/>
+        </w:rPr>
+        <w:t>Imagine two versions of the same city map — one for boys, one for girls. Configural invariance = both versions have the same kind of map (roads, intersections). Metric invariance = the roads have the same length in both versions. Scalar invariance = the starting point is at the same address. If any level fails, the maps differ in a specific way — and that is where gender matters.</w:t>
+      </w:r>
+    </w:p>
+    <w:p>
+      <w:pPr>
+        <w:spacing w:after="160"/>
+        <w:ind w:firstLine="283" w:left="170"/>
+        <w:jc w:val="both"/>
+      </w:pPr>
+      <w:r>
+        <w:rPr>
+          <w:rFonts w:ascii="Times New Roman" w:hAnsi="Times New Roman"/>
+          <w:i/>
+          <w:color w:val="333333"/>
+          <w:sz w:val="22"/>
+        </w:rPr>
+        <w:t>Hãy tưởng tượng hai phiên bản của cùng một bản đồ thành phố — một cho nam, một cho nữ. Bất biến cấu hình = cả hai phiên bản có cùng kiểu bản đồ (đường, giao lộ). Bất biến metric = các con đường có cùng độ dài ở cả hai phiên bản. Bất biến scalar = điểm xuất phát ở cùng địa chỉ. Nếu bất kỳ mức nào không đạt, hai bản đồ khác nhau theo cách cụ thể — và đó là nơi giới có vai trò.</w:t>
+      </w:r>
+    </w:p>
+    <w:p>
+      <w:pPr>
+        <w:spacing w:before="200" w:after="80"/>
+      </w:pPr>
+      <w:r>
+        <w:rPr>
+          <w:rFonts w:ascii="Times New Roman" w:hAnsi="Times New Roman"/>
+          <w:b/>
+          <w:color w:val="2E74B5"/>
+          <w:sz w:val="24"/>
+        </w:rPr>
+        <w:t>9.4 — Cultural-developmental framing / Khung phát triển-văn hóa</w:t>
       </w:r>
     </w:p>
     <w:p>
@@ -1920,6 +2730,124 @@
           <w:sz w:val="22"/>
         </w:rPr>
         <w:t>▣ KHÁI NIỆM CỐT LÕI — Ba bài từ một bộ dữ liệu lớn, mỗi bài một góc độ khác nhau: Q2 (cơ chế tích hợp), Q3 (bất biến giới), Q4 (phân loại học sinh). Đây là mẫu hình "hat-trick" phổ biến trong các chương trình cohort có tầm ảnh hưởng cao.</w:t>
+      </w:r>
+    </w:p>
+    <w:p>
+      <w:pPr>
+        <w:spacing w:before="200" w:after="80"/>
+      </w:pPr>
+      <w:r>
+        <w:rPr>
+          <w:rFonts w:ascii="Times New Roman" w:hAnsi="Times New Roman"/>
+          <w:b/>
+          <w:color w:val="2E74B5"/>
+          <w:sz w:val="24"/>
+        </w:rPr>
+        <w:t>10.4 — LPA analogy / Phép ẩn dụ về LPA</w:t>
+      </w:r>
+    </w:p>
+    <w:p>
+      <w:pPr>
+        <w:spacing w:after="80"/>
+        <w:ind w:firstLine="283"/>
+        <w:jc w:val="both"/>
+      </w:pPr>
+      <w:r>
+        <w:rPr>
+          <w:rFonts w:ascii="Times New Roman" w:hAnsi="Times New Roman"/>
+          <w:sz w:val="22"/>
+        </w:rPr>
+        <w:t>LPA is like sorting a library. SEM asks "does this book's thickness predict its number of pages?" — a variable-by-variable question. LPA asks "are these books naturally grouped into shelves — fiction, science, history — based on patterns of multiple features together?" In our data, LPA may reveal student profiles such as "high-stress + low-support + high-anxiety" vs "moderate-stress + high-self-esteem + low-anxiety".</w:t>
+      </w:r>
+    </w:p>
+    <w:p>
+      <w:pPr>
+        <w:spacing w:after="160"/>
+        <w:ind w:firstLine="283" w:left="170"/>
+        <w:jc w:val="both"/>
+      </w:pPr>
+      <w:r>
+        <w:rPr>
+          <w:rFonts w:ascii="Times New Roman" w:hAnsi="Times New Roman"/>
+          <w:i/>
+          <w:color w:val="333333"/>
+          <w:sz w:val="22"/>
+        </w:rPr>
+        <w:t>LPA giống như sắp xếp thư viện. SEM hỏi "độ dày của cuốn sách có dự báo số trang của nó không?" — câu hỏi từng biến một. LPA hỏi "các cuốn sách có tự nhiên phân nhóm thành các kệ — tiểu thuyết, khoa học, lịch sử — dựa trên mẫu hình của nhiều đặc điểm cùng lúc không?" Trong dữ liệu, LPA có thể phát hiện các hồ sơ học sinh như "cao áp lực + thấp hỗ trợ + cao lo âu" vs "vừa áp lực + cao tự trọng + thấp lo âu".</w:t>
+      </w:r>
+    </w:p>
+    <w:p>
+      <w:pPr>
+        <w:spacing w:before="200" w:after="80"/>
+      </w:pPr>
+      <w:r>
+        <w:rPr>
+          <w:rFonts w:ascii="Times New Roman" w:hAnsi="Times New Roman"/>
+          <w:b/>
+          <w:color w:val="2E74B5"/>
+          <w:sz w:val="24"/>
+        </w:rPr>
+        <w:t>10.5 — Self-check / Câu hỏi tự kiểm tra</w:t>
+      </w:r>
+    </w:p>
+    <w:p>
+      <w:pPr>
+        <w:spacing w:after="80"/>
+        <w:ind w:firstLine="283"/>
+        <w:jc w:val="both"/>
+      </w:pPr>
+      <w:r>
+        <w:rPr>
+          <w:rFonts w:ascii="Times New Roman" w:hAnsi="Times New Roman"/>
+          <w:sz w:val="22"/>
+        </w:rPr>
+        <w:t>Q: Why doesn't LPA double-publish on Q2/Q3 data?</w:t>
+      </w:r>
+    </w:p>
+    <w:p>
+      <w:pPr>
+        <w:spacing w:after="160"/>
+        <w:ind w:firstLine="283" w:left="170"/>
+        <w:jc w:val="both"/>
+      </w:pPr>
+      <w:r>
+        <w:rPr>
+          <w:rFonts w:ascii="Times New Roman" w:hAnsi="Times New Roman"/>
+          <w:i/>
+          <w:color w:val="333333"/>
+          <w:sz w:val="22"/>
+        </w:rPr>
+        <w:t>Hỏi: Vì sao LPA không bị tính là tự đạo văn từ dữ liệu Q2/Q3?</w:t>
+      </w:r>
+    </w:p>
+    <w:p>
+      <w:pPr>
+        <w:spacing w:after="80"/>
+        <w:ind w:firstLine="283"/>
+        <w:jc w:val="both"/>
+      </w:pPr>
+      <w:r>
+        <w:rPr>
+          <w:rFonts w:ascii="Times New Roman" w:hAnsi="Times New Roman"/>
+          <w:sz w:val="22"/>
+        </w:rPr>
+        <w:t>A: Variable-centered (SEM) and person-centered (LPA) answer fundamentally different scientific questions and use different statistical mechanics — like asking "how tall is the average tree?" vs "what kinds of trees grow here?"</w:t>
+      </w:r>
+    </w:p>
+    <w:p>
+      <w:pPr>
+        <w:spacing w:after="160"/>
+        <w:ind w:firstLine="283" w:left="170"/>
+        <w:jc w:val="both"/>
+      </w:pPr>
+      <w:r>
+        <w:rPr>
+          <w:rFonts w:ascii="Times New Roman" w:hAnsi="Times New Roman"/>
+          <w:i/>
+          <w:color w:val="333333"/>
+          <w:sz w:val="22"/>
+        </w:rPr>
+        <w:t>Đáp: Cách tiếp cận lấy biến làm trung tâm (SEM) và lấy con người làm trung tâm (LPA) trả lời các câu hỏi khoa học khác nhau về bản chất và dùng cơ chế thống kê khác nhau — giống như hỏi "cây trung bình cao bao nhiêu?" vs "có những loài cây gì mọc ở đây?"</w:t>
       </w:r>
     </w:p>
     <w:p>

</xml_diff>